<commit_message>
Bay doan video huong dan cho giao vien, 4 phut tong cong
Moi doan mot viec, 22-47 giay. Co y khong gop thanh mot video dai: thay co can
tra mot chuc nang thi mo dung doan do, khong phai tua hai muoi phut.

Moi doan ra hai tep: .mp4 (phu de in san, nhac nen CC0, tieng click dat dung
thoi diem bam) va .srt roi de dua vao cong cu long tieng.

Bat duoc mot loi NOI DUNG khi quay: man hinh nhap danh sach yeu cau BA cot
(STT, MSHS, Ho va ten hoc sinh), ma ban Word viet la hai cot. Da sua ca trong
tai lieu lan trong loi thoai video.

Muon chinh to nho nhac nen: MUC_NHAC=0.8 node scripts/video-gv.mjs

Co-Authored-By: Claude Opus 5 <noreply@anthropic.com>
</commit_message>
<xml_diff>
--- a/docs/huong-dan/Huong-dan-giao-vien.docx
+++ b/docs/huong-dan/Huong-dan-giao-vien.docx
@@ -2617,7 +2617,59 @@
           <w:sz w:val="22"/>
           <w:szCs w:val="22"/>
         </w:rPr>
-        <w:t xml:space="preserve">Tải file mẫu, điền hai cột </w:t>
+        <w:t xml:space="preserve">Bấm </w:t>
+      </w:r>
+      <w:r>
+        <w:rPr>
+          <w:rFonts w:ascii="Arial" w:cs="Arial" w:eastAsia="Arial" w:hAnsi="Arial"/>
+          <w:b/>
+          <w:bCs/>
+          <w:i w:val="false"/>
+          <w:iCs w:val="false"/>
+          <w:color w:val="1A1A1A"/>
+          <w:sz w:val="22"/>
+          <w:szCs w:val="22"/>
+        </w:rPr>
+        <w:t xml:space="preserve">Tải file mẫu Excel</w:t>
+      </w:r>
+      <w:r>
+        <w:rPr>
+          <w:rFonts w:ascii="Arial" w:cs="Arial" w:eastAsia="Arial" w:hAnsi="Arial"/>
+          <w:b w:val="false"/>
+          <w:bCs w:val="false"/>
+          <w:i w:val="false"/>
+          <w:iCs w:val="false"/>
+          <w:color w:val="1A1A1A"/>
+          <w:sz w:val="22"/>
+          <w:szCs w:val="22"/>
+        </w:rPr>
+        <w:t xml:space="preserve">, điền ba cột </w:t>
+      </w:r>
+      <w:r>
+        <w:rPr>
+          <w:rFonts w:ascii="Arial" w:cs="Arial" w:eastAsia="Arial" w:hAnsi="Arial"/>
+          <w:b/>
+          <w:bCs/>
+          <w:i w:val="false"/>
+          <w:iCs w:val="false"/>
+          <w:color w:val="1A1A1A"/>
+          <w:sz w:val="22"/>
+          <w:szCs w:val="22"/>
+        </w:rPr>
+        <w:t xml:space="preserve">STT</w:t>
+      </w:r>
+      <w:r>
+        <w:rPr>
+          <w:rFonts w:ascii="Arial" w:cs="Arial" w:eastAsia="Arial" w:hAnsi="Arial"/>
+          <w:b w:val="false"/>
+          <w:bCs w:val="false"/>
+          <w:i w:val="false"/>
+          <w:iCs w:val="false"/>
+          <w:color w:val="1A1A1A"/>
+          <w:sz w:val="22"/>
+          <w:szCs w:val="22"/>
+        </w:rPr>
+        <w:t xml:space="preserve">, </w:t>
       </w:r>
       <w:r>
         <w:rPr>
@@ -2643,33 +2695,33 @@
           <w:sz w:val="22"/>
           <w:szCs w:val="22"/>
         </w:rPr>
-        <w:t xml:space="preserve"> và </w:t>
-      </w:r>
-      <w:r>
-        <w:rPr>
-          <w:rFonts w:ascii="Arial" w:cs="Arial" w:eastAsia="Arial" w:hAnsi="Arial"/>
-          <w:b/>
-          <w:bCs/>
-          <w:i w:val="false"/>
-          <w:iCs w:val="false"/>
-          <w:color w:val="1A1A1A"/>
-          <w:sz w:val="22"/>
-          <w:szCs w:val="22"/>
-        </w:rPr>
-        <w:t xml:space="preserve">Họ và tên</w:t>
-      </w:r>
-      <w:r>
-        <w:rPr>
-          <w:rFonts w:ascii="Arial" w:cs="Arial" w:eastAsia="Arial" w:hAnsi="Arial"/>
-          <w:b w:val="false"/>
-          <w:bCs w:val="false"/>
-          <w:i w:val="false"/>
-          <w:iCs w:val="false"/>
-          <w:color w:val="1A1A1A"/>
-          <w:sz w:val="22"/>
-          <w:szCs w:val="22"/>
-        </w:rPr>
-        <w:t xml:space="preserve">, rồi chọn file.</w:t>
+        <w:t xml:space="preserve">, </w:t>
+      </w:r>
+      <w:r>
+        <w:rPr>
+          <w:rFonts w:ascii="Arial" w:cs="Arial" w:eastAsia="Arial" w:hAnsi="Arial"/>
+          <w:b/>
+          <w:bCs/>
+          <w:i w:val="false"/>
+          <w:iCs w:val="false"/>
+          <w:color w:val="1A1A1A"/>
+          <w:sz w:val="22"/>
+          <w:szCs w:val="22"/>
+        </w:rPr>
+        <w:t xml:space="preserve">Họ và tên học sinh</w:t>
+      </w:r>
+      <w:r>
+        <w:rPr>
+          <w:rFonts w:ascii="Arial" w:cs="Arial" w:eastAsia="Arial" w:hAnsi="Arial"/>
+          <w:b w:val="false"/>
+          <w:bCs w:val="false"/>
+          <w:i w:val="false"/>
+          <w:iCs w:val="false"/>
+          <w:color w:val="1A1A1A"/>
+          <w:sz w:val="22"/>
+          <w:szCs w:val="22"/>
+        </w:rPr>
+        <w:t xml:space="preserve"> — giữ nguyên tên cột ở dòng đầu — rồi chọn file.</w:t>
       </w:r>
     </w:p>
     <w:p>

</xml_diff>